<commit_message>
fix: identify the Lakshmi entry as LMW (Lakshmi Machine Works)
The source document said only "Lakshmi Mill textile machinery", which is
ambiguous -- Lakshmi Machine Works and The Lakshmi Mills Co are separate
Coimbatore companies. Anoora confirms it is Lakshmi Machine Works, the
spinning machinery manufacturer, so the register now says "LMW" (matching
the abbreviated style already used for KMCH, KRC and CRI Pumps) rather than
the ambiguous "Lakshmi Mill". Stays under Industrial & Manufacturing.

Co-Authored-By: Claude Opus 5 <noreply@anthropic.com>
</commit_message>
<xml_diff>
--- a/Anoora Project Names.docx
+++ b/Anoora Project Names.docx
@@ -1177,6 +1177,44 @@
     <w:p>
       <w:r>
         <w:t xml:space="preserve">- Shiny Textile Process - no place recorded</w:t>
+      </w:r>
+    </w:p>
+    <w:p>
+      <w:pPr>
+        <w:spacing w:before="240"/>
+      </w:pPr>
+      <w:r>
+        <w:rPr>
+          <w:b/>
+          <w:sz w:val="24"/>
+        </w:rPr>
+        <w:t xml:space="preserve">Resolved: Lakshmi Mill</w:t>
+      </w:r>
+    </w:p>
+    <w:p>
+      <w:pPr>
+        <w:spacing w:before="240"/>
+      </w:pPr>
+      <w:r>
+        <w:rPr>
+          <w:b/>
+        </w:rPr>
+        <w:t xml:space="preserve">LMW (Lakshmi Machine Works) - Coimbatore</w:t>
+      </w:r>
+    </w:p>
+    <w:p>
+      <w:r>
+        <w:t xml:space="preserve">Confirmed by Anoora: this is Lakshmi Machine Works (textile spinning machinery, founded 1962), NOT The Lakshmi Mills Co (yarn/cloth). Listed on the site as 'LMW'. Stays under Industrial &amp; Manufacturing.</w:t>
+      </w:r>
+    </w:p>
+    <w:p>
+      <w:r>
+        <w:t xml:space="preserve">https://en.wikipedia.org/wiki/Lakshmi_Machine_Works</w:t>
+      </w:r>
+    </w:p>
+    <w:p>
+      <w:r>
+        <w:t xml:space="preserve">https://www.lmwtmd.com/</w:t>
       </w:r>
     </w:p>
     <w:sectPr>

</xml_diff>

<commit_message>
fix: identify "Shiny Textile Process" as Shiny Knitwear, Tiruppur
The source document ran this together with "Bala Silks" on one line and gave
no place, so it went in unverified and place-less. Anoora confirms it is
Shiny Knitwear of Tiruppur -- knitwear manufacturer and exporter, Appachi
Nagar, established 1997. Name corrected and place added; stays under
Textiles & Apparel.

Co-Authored-By: Claude Opus 5 <noreply@anthropic.com>
</commit_message>
<xml_diff>
--- a/Anoora Project Names.docx
+++ b/Anoora Project Names.docx
@@ -1215,6 +1215,44 @@
     <w:p>
       <w:r>
         <w:t xml:space="preserve">https://www.lmwtmd.com/</w:t>
+      </w:r>
+    </w:p>
+    <w:p>
+      <w:pPr>
+        <w:spacing w:before="240"/>
+      </w:pPr>
+      <w:r>
+        <w:rPr>
+          <w:b/>
+          <w:sz w:val="24"/>
+        </w:rPr>
+        <w:t xml:space="preserve">Resolved: Shiny Textile Process</w:t>
+      </w:r>
+    </w:p>
+    <w:p>
+      <w:pPr>
+        <w:spacing w:before="240"/>
+      </w:pPr>
+      <w:r>
+        <w:rPr>
+          <w:b/>
+        </w:rPr>
+        <w:t xml:space="preserve">Shiny Knitwear - Tiruppur</w:t>
+      </w:r>
+    </w:p>
+    <w:p>
+      <w:r>
+        <w:t xml:space="preserve">Confirmed by Anoora. Shiny Knitwear Pvt Ltd, 24 Appachi Nagar Main Road, Tiruppur - knitwear manufacturer &amp; exporter, established 1997, ~4 lakh garments/month. Listed as 'Shiny Knitwear, Tiruppur'. Stays under Textiles &amp; Apparel.</w:t>
+      </w:r>
+    </w:p>
+    <w:p>
+      <w:r>
+        <w:t xml:space="preserve">https://shinyknitwear.in/about/</w:t>
+      </w:r>
+    </w:p>
+    <w:p>
+      <w:r>
+        <w:t xml:space="preserve">https://www.indiamart.com/shiny-knitwear/aboutus.html</w:t>
       </w:r>
     </w:p>
     <w:sectPr>

</xml_diff>

<commit_message>
fix: split Care24 and Kalyani Kidney Care into separate entries
The source document listed both on one line ("Care24, Kalyani Kidney Care -
Erode"), so they went in as a single combined entry. Anoora confirms they
are two separate projects. Both now listed individually under Healthcare.

Co-Authored-By: Claude Opus 5 <noreply@anthropic.com>
</commit_message>
<xml_diff>
--- a/Anoora Project Names.docx
+++ b/Anoora Project Names.docx
@@ -1253,6 +1253,44 @@
     <w:p>
       <w:r>
         <w:t xml:space="preserve">https://www.indiamart.com/shiny-knitwear/aboutus.html</w:t>
+      </w:r>
+    </w:p>
+    <w:p>
+      <w:pPr>
+        <w:spacing w:before="240"/>
+      </w:pPr>
+      <w:r>
+        <w:rPr>
+          <w:b/>
+          <w:sz w:val="24"/>
+        </w:rPr>
+        <w:t xml:space="preserve">Resolved: Care24 / Kalyani Kidney Care</w:t>
+      </w:r>
+    </w:p>
+    <w:p>
+      <w:pPr>
+        <w:spacing w:before="240"/>
+      </w:pPr>
+      <w:r>
+        <w:rPr>
+          <w:b/>
+        </w:rPr>
+        <w:t xml:space="preserve">Care24 - Erode  AND  Kalyani Kidney Care - Erode</w:t>
+      </w:r>
+    </w:p>
+    <w:p>
+      <w:r>
+        <w:t xml:space="preserve">Confirmed by Anoora: these are TWO separate projects, not one. The source document listed them on a single line ('Care24, Kalyani Kidney Care - Erode'). Now listed as two entries under Healthcare.</w:t>
+      </w:r>
+    </w:p>
+    <w:p>
+      <w:r>
+        <w:t xml:space="preserve">Kalyani Kidney Care: nephro-urology centre, Erode, established 2004.</w:t>
+      </w:r>
+    </w:p>
+    <w:p>
+      <w:r>
+        <w:t xml:space="preserve">https://www.medindia.net/directories/hospitals/kalyani-kidney-care-centre-erode-tamil-nadu-4977.htm</w:t>
       </w:r>
     </w:p>
     <w:sectPr>

</xml_diff>

<commit_message>
chore: set project years from the invoice register
Years taken from the handwritten invoice ledger (12 projects). Updated the
detail pages, the Word register (years appended to matching entries plus an
Invoice Dates section), and the review register. Madurai Marriott has no
invoice date on record and stays 'to confirm'.

Co-Authored-By: Claude Opus 5 <noreply@anthropic.com>
</commit_message>
<xml_diff>
--- a/Anoora Project Names.docx
+++ b/Anoora Project Names.docx
@@ -9,11 +9,17 @@
       <w:r>
         <w:t>Mariott - Hotel</w:t>
       </w:r>
+      <w:r>
+        <w:t xml:space="preserve"> – Trichy 2022</w:t>
+      </w:r>
     </w:p>
     <w:p>
       <w:r>
         <w:t>Milky Mist - Industry</w:t>
       </w:r>
+      <w:r>
+        <w:t xml:space="preserve"> – 2024</w:t>
+      </w:r>
     </w:p>
     <w:p>
       <w:r>
@@ -29,6 +35,9 @@
       <w:r>
         <w:t xml:space="preserve"> – Promoter</w:t>
       </w:r>
+      <w:r>
+        <w:t xml:space="preserve"> – 2024</w:t>
+      </w:r>
     </w:p>
     <w:p>
       <w:proofErr w:type="spellStart"/>
@@ -44,6 +53,9 @@
       <w:r>
         <w:t>Cotton city – Promoters</w:t>
       </w:r>
+      <w:r>
+        <w:t xml:space="preserve"> – 2022</w:t>
+      </w:r>
     </w:p>
     <w:p>
       <w:r>
@@ -62,6 +74,9 @@
       </w:r>
       <w:r>
         <w:t>Ooty</w:t>
+      </w:r>
+      <w:r>
+        <w:t xml:space="preserve"> – 2024</w:t>
       </w:r>
     </w:p>
     <w:p>
@@ -212,6 +227,9 @@
       <w:r>
         <w:t xml:space="preserve"> – Bhavani</w:t>
       </w:r>
+      <w:r>
+        <w:t xml:space="preserve"> – 2017</w:t>
+      </w:r>
     </w:p>
     <w:p/>
     <w:p>
@@ -1291,6 +1309,83 @@
     <w:p>
       <w:r>
         <w:t xml:space="preserve">https://www.medindia.net/directories/hospitals/kalyani-kidney-care-centre-erode-tamil-nadu-4977.htm</w:t>
+      </w:r>
+    </w:p>
+    <w:p>
+      <w:pPr>
+        <w:spacing w:before="240"/>
+      </w:pPr>
+      <w:r>
+        <w:rPr>
+          <w:b/>
+          <w:sz w:val="28"/>
+        </w:rPr>
+        <w:t xml:space="preserve">INVOICE DATES – project years</w:t>
+      </w:r>
+    </w:p>
+    <w:p>
+      <w:r>
+        <w:t xml:space="preserve">Added 2026-09-11 from the invoice register. Year = year of invoice.</w:t>
+      </w:r>
+    </w:p>
+    <w:p>
+      <w:r>
+        <w:t xml:space="preserve">Thiruvalluvar Statue – 30/6/23 – 2023</w:t>
+      </w:r>
+    </w:p>
+    <w:p>
+      <w:r>
+        <w:t xml:space="preserve">Smart City – 2/11/2020 – 2020</w:t>
+      </w:r>
+    </w:p>
+    <w:p>
+      <w:r>
+        <w:t xml:space="preserve">G.D. Naidu Bridge – 26/7/25 – 2025</w:t>
+      </w:r>
+    </w:p>
+    <w:p>
+      <w:r>
+        <w:t xml:space="preserve">Horse Court – 30/4/25 – 2025</w:t>
+      </w:r>
+    </w:p>
+    <w:p>
+      <w:r>
+        <w:t xml:space="preserve">Karthipuram – 30/12/24 – 2024</w:t>
+      </w:r>
+    </w:p>
+    <w:p>
+      <w:r>
+        <w:t xml:space="preserve">Makino – 13/5/24 – 2024</w:t>
+      </w:r>
+    </w:p>
+    <w:p>
+      <w:r>
+        <w:t xml:space="preserve">Trichy Marriott – 1/8/22 – 2022</w:t>
+      </w:r>
+    </w:p>
+    <w:p>
+      <w:r>
+        <w:t xml:space="preserve">Darza – 22/6/22 – 2022</w:t>
+      </w:r>
+    </w:p>
+    <w:p>
+      <w:r>
+        <w:t xml:space="preserve">Cotton City – 8/4/22 – 2022</w:t>
+      </w:r>
+    </w:p>
+    <w:p>
+      <w:r>
+        <w:t xml:space="preserve">Mango Hills – 12/8/24 – 2024</w:t>
+      </w:r>
+    </w:p>
+    <w:p>
+      <w:r>
+        <w:t xml:space="preserve">Kalingarayan Statue – 2017 (year only) – 2017</w:t>
+      </w:r>
+    </w:p>
+    <w:p>
+      <w:r>
+        <w:t xml:space="preserve">Milky Mist Cafe – 12/9/24 – 2024</w:t>
       </w:r>
     </w:p>
     <w:sectPr>

</xml_diff>